<commit_message>
Actualizando render en git
</commit_message>
<xml_diff>
--- a/docs/MBP-ALC.docx
+++ b/docs/MBP-ALC.docx
@@ -16,14 +16,6 @@
       </w:pPr>
       <w:r>
         <w:t xml:space="preserve">Implementación, Validación y Aplicación Subnacional</w:t>
-      </w:r>
-    </w:p>
-    <w:p>
-      <w:pPr>
-        <w:pStyle w:val="Date"/>
-      </w:pPr>
-      <w:r>
-        <w:t xml:space="preserve">Agosto 2026</w:t>
       </w:r>
     </w:p>
     <w:sdt>

</xml_diff>